<commit_message>
Thêm thư mục Đảm bảo chất lượng 2022 và cập nhật CD15-CD18
- Tạo thư mục 'Chuyên đề kiểm kê KNKQG 2023/Đảm bảo chất lượng 2022/' với 12 file BC19-BC30
- Cập nhật year references (2020→2022) trong tất cả file BC
- Cập nhật emission values trong BC19 và BC27
- Cập nhật CD15-CD18 với year references mới
- Thêm file đánh giá DANH_GIA_BC_BC2022.md
</commit_message>
<xml_diff>
--- a/cai thien kiem ke/CD15_7.1 Cai thien kiem ke linh vuc nang luong.docx
+++ b/cai thien kiem ke/CD15_7.1 Cai thien kiem ke linh vuc nang luong.docx
@@ -4719,7 +4719,7 @@
         <w:rPr>
           <w:rtl w:val="0"/>
         </w:rPr>
-        <w:t xml:space="preserve">Sau khi Thỏa thuận Paris về biến đổi khí hậu được thông qua tại COP21 ràng buộc trách nhiệm của tất cả các bên trong công tác cắt giảm phát thải khí nhà kính, NAMA được đưa vào Đóng góp dự kiến do quốc gia tự quyết định (INDC) với vai trò là các giải pháp để đạt được các mục tiêu giảm phát thải đề ra trong INDC. Có thể nói, Thỏa thuận Paris thông qua việc ràng buộc trách nhiệm các Bên phải thực hiện Đóng góp do quốc gia tự quyết định (NDC) vào năm 2020 đã cung cấp một khuôn khổ rõ ràng hơn cũng như tạo động lực để các quốc gia triển khai NAMA và các chương trình hành động giảm phát thải khí nhà kính, đóng góp vào mục tiêu giảm phát thải chung toàn cầu để có thể giữ nhiệt độ trái đất vào cuối thế kỷ tăng không quá 2oC so với thời kỳ tiền công nghiệp. </w:t>
+        <w:t xml:space="preserve">Sau khi Thỏa thuận Paris về biến đổi khí hậu được thông qua tại COP21 ràng buộc trách nhiệm của tất cả các bên trong công tác cắt giảm phát thải khí nhà kính, NAMA được đưa vào Đóng góp dự kiến do quốc gia tự quyết định (INDC) với vai trò là các giải pháp để đạt được các mục tiêu giảm phát thải đề ra trong INDC. Có thể nói, Thỏa thuận Paris thông qua việc ràng buộc trách nhiệm các Bên phải thực hiện Đóng góp do quốc gia tự quyết định (NDC) vào năm 2022 đã cung cấp một khuôn khổ rõ ràng hơn cũng như tạo động lực để các quốc gia triển khai NAMA và các chương trình hành động giảm phát thải khí nhà kính, đóng góp vào mục tiêu giảm phát thải chung toàn cầu để có thể giữ nhiệt độ trái đất vào cuối thế kỷ tăng không quá 2oC so với thời kỳ tiền công nghiệp. </w:t>
       </w:r>
     </w:p>
     <w:p>
@@ -5905,7 +5905,7 @@
           <w:vertAlign w:val="baseline"/>
           <w:rtl w:val="0"/>
         </w:rPr>
-        <w:t xml:space="preserve">Bảng 1.2. Phát thải khí nhà kính cho năm 2010, 2020 và ước tính cho năm 2030</w:t>
+        <w:t>Bảng 1.2. Phát thải khí nhà kính cho năm 2010, 2022 và ước tính cho năm 2030</w:t>
       </w:r>
     </w:p>
     <w:tbl>
@@ -6653,7 +6653,7 @@
         <w:rPr>
           <w:rtl w:val="0"/>
         </w:rPr>
-        <w:t xml:space="preserve">Nền kinh tế năng lượng Việt Nam đã thay đổi nhanh chóng trong vài thập kỷ qua với việc chuyển mình từ một nền kinh tế nông nghiệp dựa trên các loại nhiên liệu sinh khối truyền thống sang một nền kinh tế sản xuất và sử dụng hỗn hợp các loại nhiên liệu và hiện đại. Quy mô GDP tăng gấp 2,4 lần, từ 116 tỉ USD năm 2010 lên 268,4 tỉ USD vào năm 2020. GDP bình quân đầu người tăng từ 1.331 USD năm 2010 lên khoảng 2.750 USD năm 2020.</w:t>
+        <w:t>Nền kinh tế năng lượng Việt Nam đã thay đổi nhanh chóng trong vài thập kỷ qua với việc chuyển mình từ một nền kinh tế nông nghiệp dựa trên các loại nhiên liệu sinh khối truyền thống sang một nền kinh tế sản xuất và sử dụng hỗn hợp các loại nhiên liệu và hiện đại. Quy mô GDP tăng gấp 2,4 lần, từ 116 tỉ USD năm 2010 lên 268,4 tỉ USD vào năm 2022. GDP bình quân đầu người tăng từ 1.331 USD năm 2010 lên khoảng 2.750 USD năm 2022.</w:t>
       </w:r>
     </w:p>
     <w:p>
@@ -9055,7 +9055,7 @@
           <w:szCs w:val="26"/>
           <w:rtl w:val="0"/>
         </w:rPr>
-        <w:t xml:space="preserve">Nguồn: Viện Năng lượng, Thống kê Năng lượng Việt Nam 2019, tháng 12/2020</w:t>
+        <w:t>Nguồn: Viện Năng lượng, Thống kê Năng lượng Việt Nam 2019, tháng 12/2022</w:t>
       </w:r>
     </w:p>
     <w:p>
@@ -11040,7 +11040,7 @@
           <w:szCs w:val="26"/>
           <w:rtl w:val="0"/>
         </w:rPr>
-        <w:t xml:space="preserve">Nguồn: Viện Năng lượng, Thống kê Năng lượng Việt Nam 2019, tháng 12/2020</w:t>
+        <w:t>Nguồn: Viện Năng lượng, Thống kê Năng lượng Việt Nam 2019, tháng 12/2022</w:t>
       </w:r>
     </w:p>
     <w:p>
@@ -13021,7 +13021,7 @@
           <w:szCs w:val="26"/>
           <w:rtl w:val="0"/>
         </w:rPr>
-        <w:t xml:space="preserve">Nguồn: Viện Năng lượng, Thống kê Năng lượng Việt Nam 2019, tháng 12/2020</w:t>
+        <w:t>Nguồn: Viện Năng lượng, Thống kê Năng lượng Việt Nam 2019, tháng 12/2022</w:t>
       </w:r>
     </w:p>
     <w:p>
@@ -15483,7 +15483,7 @@
           <w:szCs w:val="26"/>
           <w:rtl w:val="0"/>
         </w:rPr>
-        <w:t xml:space="preserve">Nguồn: Viện Năng lượng, Thống kê Năng lượng Việt Nam 2019, tháng 12/2020</w:t>
+        <w:t>Nguồn: Viện Năng lượng, Thống kê Năng lượng Việt Nam 2019, tháng 12/2022</w:t>
       </w:r>
     </w:p>
     <w:p>
@@ -27912,7 +27912,7 @@
           <w:color w:val="000000"/>
           <w:rtl w:val="0"/>
         </w:rPr>
-        <w:t xml:space="preserve">- Số liệu hoạt động tàu cá được khảo sát trên vùng lộng và vùng khơi tỉnh Kiên Giang thực hiện năm 2020. Đây là tỉnh có sản lượng thủy sản lớn nhất nước, năm 2020 đạt 822 nghìn tấn, bằng 17% sản lượng thủy sản cả nước. Đây là số liệu khá tin cậy được tổng hợp từ kết quả điều tra khảo sát 2.041 phiếu điều tra năm 2020, làm căn cứ để tính toán số liệu hoạt động tàu cá của các tỉnh còn lại. Số liệu hoạt động tàu cá các tỉnh còn lại được ngoại suy theo năng suất khai thác của tàu thuyền trong năm.</w:t>
+        <w:t>- Số liệu hoạt động tàu cá được khảo sát trên vùng lộng và vùng khơi tỉnh Kiên Giang thực hiện năm 2022. Đây là tỉnh có sản lượng thủy sản lớn nhất nước, năm 2022 đạt 822 nghìn tấn, bằng 17% sản lượng thủy sản cả nước. Đây là số liệu khá tin cậy được tổng hợp từ kết quả điều tra khảo sát 2.041 phiếu điều tra năm 2022, làm căn cứ để tính toán số liệu hoạt động tàu cá của các tỉnh còn lại. Số liệu hoạt động tàu cá các tỉnh còn lại được ngoại suy theo năng suất khai thác của tàu thuyền trong năm.</w:t>
       </w:r>
     </w:p>
     <w:p>

</xml_diff>